<commit_message>
docs: align API contracts and restructure testing examples
</commit_message>
<xml_diff>
--- a/pruebas/3.1-Plan-de-Pruebas-BrainSort.docx
+++ b/pruebas/3.1-Plan-de-Pruebas-BrainSort.docx
@@ -1257,7 +1257,7 @@
         <w:pStyle w:val="ListBullet"/>
       </w:pPr>
       <w:r>
-        <w:t>Rama usada para evidencias: feature/unit-tests-qa.</w:t>
+        <w:t>Rama usada para evidencias: API feature/unit-tests-qa; APP feature/contract-consistency-fixes.</w:t>
       </w:r>
     </w:p>
     <w:p>
@@ -2088,7 +2088,51 @@
               <w:rPr>
                 <w:sz w:val="17"/>
               </w:rPr>
-              <w:t>CP-OFF-*, CP-SYNC-*</w:t>
+              <w:t>CP-OFF-*, CP-SYNC-*, CP-LRN-003</w:t>
+            </w:r>
+          </w:p>
+        </w:tc>
+      </w:tr>
+      <w:tr>
+        <w:tc>
+          <w:tcPr>
+            <w:tcW w:type="dxa" w:w="3312"/>
+            <w:vAlign w:val="top"/>
+          </w:tcPr>
+          <w:p>
+            <w:r>
+              <w:rPr>
+                <w:sz w:val="17"/>
+              </w:rPr>
+              <w:t>RF-DIAG/RF-RUTA/RF-INS</w:t>
+            </w:r>
+          </w:p>
+        </w:tc>
+        <w:tc>
+          <w:tcPr>
+            <w:tcW w:type="dxa" w:w="3312"/>
+            <w:vAlign w:val="top"/>
+          </w:tcPr>
+          <w:p>
+            <w:r>
+              <w:rPr>
+                <w:sz w:val="17"/>
+              </w:rPr>
+              <w:t>Diagnostico, ruta e insignias</w:t>
+            </w:r>
+          </w:p>
+        </w:tc>
+        <w:tc>
+          <w:tcPr>
+            <w:tcW w:type="dxa" w:w="3312"/>
+            <w:vAlign w:val="top"/>
+          </w:tcPr>
+          <w:p>
+            <w:r>
+              <w:rPr>
+                <w:sz w:val="17"/>
+              </w:rPr>
+              <w:t>CP-DIAG-*, CP-RUTA-*, CP-INS-*, CP-LRN-*</w:t>
             </w:r>
           </w:p>
         </w:tc>
@@ -2450,7 +2494,7 @@
               <w:rPr>
                 <w:sz w:val="17"/>
               </w:rPr>
-              <w:t>11 suites / 93 tests pasados</w:t>
+              <w:t>11 suites / 94 tests pasados</w:t>
             </w:r>
           </w:p>
         </w:tc>
@@ -2494,7 +2538,7 @@
               <w:rPr>
                 <w:sz w:val="17"/>
               </w:rPr>
-              <w:t>6 suites / 28 tests pasados</w:t>
+              <w:t>7 suites / 33 tests pasados</w:t>
             </w:r>
           </w:p>
         </w:tc>
@@ -2538,7 +2582,7 @@
               <w:rPr>
                 <w:sz w:val="17"/>
               </w:rPr>
-              <w:t>6 suites / 31 tests pasados</w:t>
+              <w:t>7 suites / 35 tests pasados</w:t>
             </w:r>
           </w:p>
         </w:tc>
@@ -3425,7 +3469,7 @@
               <w:rPr>
                 <w:sz w:val="17"/>
               </w:rPr>
-              <w:t>152 tests</w:t>
+              <w:t>162 tests</w:t>
             </w:r>
           </w:p>
         </w:tc>
@@ -3455,7 +3499,7 @@
               <w:rPr>
                 <w:sz w:val="17"/>
               </w:rPr>
-              <w:t>11 suites / 93 tests pasados</w:t>
+              <w:t>11 suites / 94 tests pasados</w:t>
             </w:r>
           </w:p>
         </w:tc>
@@ -3485,7 +3529,7 @@
               <w:rPr>
                 <w:sz w:val="17"/>
               </w:rPr>
-              <w:t>6 suites / 28 tests pasados</w:t>
+              <w:t>7 suites / 33 tests pasados</w:t>
             </w:r>
           </w:p>
         </w:tc>
@@ -3515,7 +3559,7 @@
               <w:rPr>
                 <w:sz w:val="17"/>
               </w:rPr>
-              <w:t>6 suites / 31 tests pasados</w:t>
+              <w:t>7 suites / 35 tests pasados</w:t>
             </w:r>
           </w:p>
         </w:tc>
@@ -3603,7 +3647,7 @@
         <w:pStyle w:val="ListBullet"/>
       </w:pPr>
       <w:r>
-        <w:t>Evidencias de cambios: commits fecbfca y 077d316 en feature/unit-tests-qa.</w:t>
+        <w:t>Evidencias de cambios: commits 86b4413 base + cambios locales de contratos y b66290b base dev + cambios locales de contratos en feature/unit-tests-qa.</w:t>
       </w:r>
     </w:p>
     <w:p>

</xml_diff>